<commit_message>
Correct verification method after live test: blacklist test-площадка ≠ regex-pattern test
Practical testing found the "Тест-площадка: блэклист" screen returns no
match even for a correctly saved, active CUSTOM regex pattern — it
tests OM blacklist terms, not custom_patterns. Only 1 of 2 proposed
patterns actually saved (license pattern missing, needs re-adding).
Updated the instruction's verification steps to use chat + Журнал
LLM-сессий instead, and logged the finding as an open question.
</commit_message>
<xml_diff>
--- a/docs/analysis/instrukciya-novye-atributy-maskirovaniya-otchet-brokera.docx
+++ b/docs/analysis/instrukciya-novye-atributy-maskirovaniya-otchet-brokera.docx
@@ -2280,6 +2280,112 @@
     </w:p>
     <w:p>
       <w:pPr>
+        <w:spacing w:after="160" w:line="300"/>
+      </w:pPr>
+      <w:r>
+        <w:rPr>
+          <w:rFonts w:ascii="Calibri" w:cs="Calibri" w:eastAsia="Calibri" w:hAnsi="Calibri"/>
+          <w:b/>
+          <w:bCs/>
+          <w:i w:val="false"/>
+          <w:iCs w:val="false"/>
+          <w:color w:val="1A1A1A"/>
+          <w:sz w:val="21"/>
+          <w:szCs w:val="21"/>
+        </w:rPr>
+        <w:t xml:space="preserve">Статус на 17.08.2026:</w:t>
+      </w:r>
+      <w:r>
+        <w:rPr>
+          <w:rFonts w:ascii="Calibri" w:cs="Calibri" w:eastAsia="Calibri" w:hAnsi="Calibri"/>
+          <w:b w:val="false"/>
+          <w:bCs w:val="false"/>
+          <w:i w:val="false"/>
+          <w:iCs w:val="false"/>
+          <w:color w:val="1A1A1A"/>
+          <w:sz w:val="21"/>
+          <w:szCs w:val="21"/>
+        </w:rPr>
+        <w:t xml:space="preserve"> паттерн 1 (номер договора/счёта) сохранён на экране «Regex-паттерны» и активен. Паттерн 2 (номер лицензии) в списке не появился — форму нужно заполнить и нажать «Добавить» ещё раз, проверить, что он тоже попал в таблицу со статусом «активен».</w:t>
+      </w:r>
+    </w:p>
+    <w:p>
+      <w:pPr>
+        <w:spacing w:after="160" w:line="300"/>
+      </w:pPr>
+      <w:r>
+        <w:rPr>
+          <w:rFonts w:ascii="Calibri" w:cs="Calibri" w:eastAsia="Calibri" w:hAnsi="Calibri"/>
+          <w:b/>
+          <w:bCs/>
+          <w:i w:val="false"/>
+          <w:iCs w:val="false"/>
+          <w:color w:val="1A1A1A"/>
+          <w:sz w:val="21"/>
+          <w:szCs w:val="21"/>
+        </w:rPr>
+        <w:t xml:space="preserve">Как НЕ проверять</w:t>
+      </w:r>
+      <w:r>
+        <w:rPr>
+          <w:rFonts w:ascii="Calibri" w:cs="Calibri" w:eastAsia="Calibri" w:hAnsi="Calibri"/>
+          <w:b w:val="false"/>
+          <w:bCs w:val="false"/>
+          <w:i w:val="false"/>
+          <w:iCs w:val="false"/>
+          <w:color w:val="1A1A1A"/>
+          <w:sz w:val="21"/>
+          <w:szCs w:val="21"/>
+        </w:rPr>
+        <w:t xml:space="preserve"> (проверено на практике, не работает для этой цели): «База секретов» → «Блэклист ОМ» → «Тест-площадка: блэклист» — этот экран проверяет термины блэклиста (</w:t>
+      </w:r>
+      <w:r>
+        <w:rPr>
+          <w:rFonts w:ascii="Consolas" w:cs="Consolas" w:eastAsia="Consolas" w:hAnsi="Consolas"/>
+          <w:b w:val="false"/>
+          <w:bCs w:val="false"/>
+          <w:i w:val="false"/>
+          <w:iCs w:val="false"/>
+          <w:color w:val="1A1A1A"/>
+          <w:sz w:val="19"/>
+          <w:szCs w:val="19"/>
+        </w:rPr>
+        <w:t xml:space="preserve">catalog_blacklist</w:t>
+      </w:r>
+      <w:r>
+        <w:rPr>
+          <w:rFonts w:ascii="Calibri" w:cs="Calibri" w:eastAsia="Calibri" w:hAnsi="Calibri"/>
+          <w:b w:val="false"/>
+          <w:bCs w:val="false"/>
+          <w:i w:val="false"/>
+          <w:iCs w:val="false"/>
+          <w:color w:val="1A1A1A"/>
+          <w:sz w:val="21"/>
+          <w:szCs w:val="21"/>
+        </w:rPr>
+        <w:t xml:space="preserve">/OpenMetadata), не пользовательские regex-паттерны. Тест с активным, корректно сохранённым паттерном 1 и текстом, где он должен сработать, дал «Совпадений не найдено» — это не баг паттерна, это не тот тестовый экран (см. docs/platform/otkrytye-voprosy.md).</w:t>
+      </w:r>
+    </w:p>
+    <w:p>
+      <w:pPr>
+        <w:spacing w:after="160" w:line="300"/>
+      </w:pPr>
+      <w:r>
+        <w:rPr>
+          <w:rFonts w:ascii="Calibri" w:cs="Calibri" w:eastAsia="Calibri" w:hAnsi="Calibri"/>
+          <w:b/>
+          <w:bCs/>
+          <w:i w:val="false"/>
+          <w:iCs w:val="false"/>
+          <w:color w:val="1A1A1A"/>
+          <w:sz w:val="21"/>
+          <w:szCs w:val="21"/>
+        </w:rPr>
+        <w:t xml:space="preserve">Надёжный способ проверки:</w:t>
+      </w:r>
+    </w:p>
+    <w:p>
+      <w:pPr>
         <w:pStyle w:val="ListParagraph"/>
         <w:numPr>
           <w:ilvl w:val="0"/>
@@ -2298,7 +2404,7 @@
           <w:sz w:val="21"/>
           <w:szCs w:val="21"/>
         </w:rPr>
-        <w:t xml:space="preserve">«База секретов» → «Тест детекции».</w:t>
+        <w:t xml:space="preserve">Отправить тестовый текст в обычный чат платформы (как в case-03-instrukciya-proverka-maskirovaniya.md): «Договор № ВР33431 от 24.09.2019. Брокерский / лицевой счёт ВР33431 / ВР33431-МО-01. Лицензия № 045-0751».</w:t>
       </w:r>
     </w:p>
     <w:p>
@@ -2321,7 +2427,7 @@
           <w:sz w:val="21"/>
           <w:szCs w:val="21"/>
         </w:rPr>
-        <w:t xml:space="preserve">Вставить фрагмент реального отчёта или тестовый пример: «Договор № ВР33431 от 24.09.2019. Брокерский / лицевой счёт ВР33431 / ВР33431-МО-01. Лицензия № 045-0751».</w:t>
+        <w:t xml:space="preserve">Открыть «Администрирование» → «Рабочее место ИБ» → «Журнал LLM-сессий», найти свою сессию.</w:t>
       </w:r>
     </w:p>
     <w:p>
@@ -2344,7 +2450,7 @@
           <w:sz w:val="21"/>
           <w:szCs w:val="21"/>
         </w:rPr>
-        <w:t xml:space="preserve">Убедиться, что номер договора/счёта и номер лицензии заменились на токены </w:t>
+        <w:t xml:space="preserve">В сводке сессии убедиться, что номер договора/счёта и номер лицензии попали в найденные PII-spans и заменились на токены </w:t>
       </w:r>
       <w:r>
         <w:rPr>
@@ -2393,7 +2499,7 @@
           <w:sz w:val="21"/>
           <w:szCs w:val="21"/>
         </w:rPr>
-        <w:t xml:space="preserve">Отдельно прогнать через тест кусок с портфелем и балансом («ОФЗ-ПД225 — 1 шт», «16 634,88 ₽») — паттерны выше не должны их зацепить (см. самопроверку в разделе 3).</w:t>
+        <w:t xml:space="preserve">Отдельно прогнать через тот же чат кусок с портфелем и балансом («ОФЗ-ПД225 — 1 шт», «16 634,88 ₽») — паттерны выше не должны их зацепить (самопроверка на ложные срабатывания — см. раздел 3).</w:t>
       </w:r>
     </w:p>
     <w:p>
@@ -2494,7 +2600,7 @@
           <w:sz w:val="21"/>
           <w:szCs w:val="21"/>
         </w:rPr>
-        <w:t xml:space="preserve">; если тест сразу не сработал, стоит подождать один цикл синхронизации, прежде чем считать паттерн нерабочим.</w:t>
+        <w:t xml:space="preserve">; если сразу не сработало, стоит подождать один цикл синхронизации, прежде чем считать паттерн нерабочим.</w:t>
       </w:r>
     </w:p>
     <w:p>

</xml_diff>

<commit_message>
Confirm broker license regex against real document data
Real Д8 license text ("№ 045-07514-100000") shows three hyphen-separated
groups, not two as assumed from the truncated example. Updated the
regex to \d{2,3}-\d{4,6}-\d{4,6} and replaced the "format unconfirmed"
caveat with confirmation against the real number.
</commit_message>
<xml_diff>
--- a/docs/analysis/instrukciya-novye-atributy-maskirovaniya-otchet-brokera.docx
+++ b/docs/analysis/instrukciya-novye-atributy-maskirovaniya-otchet-brokera.docx
@@ -1640,7 +1640,7 @@
                 <w:sz w:val="19"/>
                 <w:szCs w:val="19"/>
               </w:rPr>
-              <w:t xml:space="preserve">№\s?\d{3}-\d{3,6}</w:t>
+              <w:t xml:space="preserve">№\s?\d{2,3}-\d{4,6}-\d{4,6}</w:t>
             </w:r>
           </w:p>
         </w:tc>
@@ -1719,15 +1719,28 @@
       <w:r>
         <w:rPr>
           <w:rFonts w:ascii="Calibri" w:cs="Calibri" w:eastAsia="Calibri" w:hAnsi="Calibri"/>
-          <w:b w:val="false"/>
-          <w:bCs w:val="false"/>
-          <w:i w:val="false"/>
-          <w:iCs w:val="false"/>
-          <w:color w:val="1A1A1A"/>
-          <w:sz w:val="21"/>
-          <w:szCs w:val="21"/>
-        </w:rPr>
-        <w:t xml:space="preserve">Проверено на примере </w:t>
+          <w:b/>
+          <w:bCs/>
+          <w:i w:val="false"/>
+          <w:iCs w:val="false"/>
+          <w:color w:val="1A1A1A"/>
+          <w:sz w:val="21"/>
+          <w:szCs w:val="21"/>
+        </w:rPr>
+        <w:t xml:space="preserve">Формат подтверждён реальным документом</w:t>
+      </w:r>
+      <w:r>
+        <w:rPr>
+          <w:rFonts w:ascii="Calibri" w:cs="Calibri" w:eastAsia="Calibri" w:hAnsi="Calibri"/>
+          <w:b w:val="false"/>
+          <w:bCs w:val="false"/>
+          <w:i w:val="false"/>
+          <w:iCs w:val="false"/>
+          <w:color w:val="1A1A1A"/>
+          <w:sz w:val="21"/>
+          <w:szCs w:val="21"/>
+        </w:rPr>
+        <w:t xml:space="preserve"> (реквизиты Д8): «Лицензия профессионального участника рынка ценных бумаг на осуществление брокерской деятельности № 045-07514-100000 от 17.03.2004 г., выдана: ФКЦБ России». Полный номер — три группы цифр через дефис (</w:t>
       </w:r>
       <w:r>
         <w:rPr>
@@ -1740,20 +1753,20 @@
           <w:sz w:val="19"/>
           <w:szCs w:val="19"/>
         </w:rPr>
-        <w:t xml:space="preserve">№ 045-0751</w:t>
-      </w:r>
-      <w:r>
-        <w:rPr>
-          <w:rFonts w:ascii="Calibri" w:cs="Calibri" w:eastAsia="Calibri" w:hAnsi="Calibri"/>
-          <w:b w:val="false"/>
-          <w:bCs w:val="false"/>
-          <w:i w:val="false"/>
-          <w:iCs w:val="false"/>
-          <w:color w:val="1A1A1A"/>
-          <w:sz w:val="21"/>
-          <w:szCs w:val="21"/>
-        </w:rPr>
-        <w:t xml:space="preserve"> → совпадение. В исходном документе номер обрезан многоточием («045-0751…») — полный формат лицензии стоит уточнить у заказчика перед включением на реальных документах: </w:t>
+        <w:t xml:space="preserve">045-07514-100000</w:t>
+      </w:r>
+      <w:r>
+        <w:rPr>
+          <w:rFonts w:ascii="Calibri" w:cs="Calibri" w:eastAsia="Calibri" w:hAnsi="Calibri"/>
+          <w:b w:val="false"/>
+          <w:bCs w:val="false"/>
+          <w:i w:val="false"/>
+          <w:iCs w:val="false"/>
+          <w:color w:val="1A1A1A"/>
+          <w:sz w:val="21"/>
+          <w:szCs w:val="21"/>
+        </w:rPr>
+        <w:t xml:space="preserve">), не две, как предполагалось изначально по обрезанному примеру. Проверено на этом реальном номере → совпадение целиком, без обрезания. Ложных срабатываний на дате выдачи (</w:t>
       </w:r>
       <w:r>
         <w:rPr>
@@ -1766,20 +1779,72 @@
           <w:sz w:val="19"/>
           <w:szCs w:val="19"/>
         </w:rPr>
-        <w:t xml:space="preserve">\d{3,6}</w:t>
-      </w:r>
-      <w:r>
-        <w:rPr>
-          <w:rFonts w:ascii="Calibri" w:cs="Calibri" w:eastAsia="Calibri" w:hAnsi="Calibri"/>
-          <w:b w:val="false"/>
-          <w:bCs w:val="false"/>
-          <w:i w:val="false"/>
-          <w:iCs w:val="false"/>
-          <w:color w:val="1A1A1A"/>
-          <w:sz w:val="21"/>
-          <w:szCs w:val="21"/>
-        </w:rPr>
-        <w:t xml:space="preserve"> во втором блоке — предположение с запасом, не факт.</w:t>
+        <w:t xml:space="preserve">17.03.2004</w:t>
+      </w:r>
+      <w:r>
+        <w:rPr>
+          <w:rFonts w:ascii="Calibri" w:cs="Calibri" w:eastAsia="Calibri" w:hAnsi="Calibri"/>
+          <w:b w:val="false"/>
+          <w:bCs w:val="false"/>
+          <w:i w:val="false"/>
+          <w:iCs w:val="false"/>
+          <w:color w:val="1A1A1A"/>
+          <w:sz w:val="21"/>
+          <w:szCs w:val="21"/>
+        </w:rPr>
+        <w:t xml:space="preserve">), адресе (</w:t>
+      </w:r>
+      <w:r>
+        <w:rPr>
+          <w:rFonts w:ascii="Consolas" w:cs="Consolas" w:eastAsia="Consolas" w:hAnsi="Consolas"/>
+          <w:b w:val="false"/>
+          <w:bCs w:val="false"/>
+          <w:i w:val="false"/>
+          <w:iCs w:val="false"/>
+          <w:color w:val="1A1A1A"/>
+          <w:sz w:val="19"/>
+          <w:szCs w:val="19"/>
+        </w:rPr>
+        <w:t xml:space="preserve">помещ. 1-5</w:t>
+      </w:r>
+      <w:r>
+        <w:rPr>
+          <w:rFonts w:ascii="Calibri" w:cs="Calibri" w:eastAsia="Calibri" w:hAnsi="Calibri"/>
+          <w:b w:val="false"/>
+          <w:bCs w:val="false"/>
+          <w:i w:val="false"/>
+          <w:iCs w:val="false"/>
+          <w:color w:val="1A1A1A"/>
+          <w:sz w:val="21"/>
+          <w:szCs w:val="21"/>
+        </w:rPr>
+        <w:t xml:space="preserve">) и номере счёта (</w:t>
+      </w:r>
+      <w:r>
+        <w:rPr>
+          <w:rFonts w:ascii="Consolas" w:cs="Consolas" w:eastAsia="Consolas" w:hAnsi="Consolas"/>
+          <w:b w:val="false"/>
+          <w:bCs w:val="false"/>
+          <w:i w:val="false"/>
+          <w:iCs w:val="false"/>
+          <w:color w:val="1A1A1A"/>
+          <w:sz w:val="19"/>
+          <w:szCs w:val="19"/>
+        </w:rPr>
+        <w:t xml:space="preserve">ВР33431-МО-01</w:t>
+      </w:r>
+      <w:r>
+        <w:rPr>
+          <w:rFonts w:ascii="Calibri" w:cs="Calibri" w:eastAsia="Calibri" w:hAnsi="Calibri"/>
+          <w:b w:val="false"/>
+          <w:bCs w:val="false"/>
+          <w:i w:val="false"/>
+          <w:iCs w:val="false"/>
+          <w:color w:val="1A1A1A"/>
+          <w:sz w:val="21"/>
+          <w:szCs w:val="21"/>
+        </w:rPr>
+        <w:t xml:space="preserve">) не даёт.</w:t>
       </w:r>
     </w:p>
     <w:p>
@@ -2404,7 +2469,7 @@
           <w:sz w:val="21"/>
           <w:szCs w:val="21"/>
         </w:rPr>
-        <w:t xml:space="preserve">Отправить тестовый текст в обычный чат платформы (как в case-03-instrukciya-proverka-maskirovaniya.md): «Договор № ВР33431 от 24.09.2019. Брокерский / лицевой счёт ВР33431 / ВР33431-МО-01. Лицензия № 045-0751».</w:t>
+        <w:t xml:space="preserve">Отправить тестовый текст в обычный чат платформы (как в case-03-instrukciya-proverka-maskirovaniya.md): «Договор № ВР33431 от 24.09.2019. Брокерский / лицевой счёт ВР33431 / ВР33431-МО-01. Лицензия № 045-07514-100000».</w:t>
       </w:r>
     </w:p>
     <w:p>

</xml_diff>

<commit_message>
Widen contract/account regex to accept Latin letters too
User confirmed contract/account codes can use Latin letters, not just
Cyrillic (test data only showed the Cyrillic case, e.g. "ВР33431").
Widened both letter groups in pattern 1 from [А-Я] to [A-ZА-Я] so
values like "BP33431" are caught too; verified it still doesn't false-
positive on ISIN codes since only 3 digits follow the letters there,
not the required 4-6. Both patterns saved in the live system now need
manual re-editing since both were saved before this and the license
number-format fix.
</commit_message>
<xml_diff>
--- a/docs/analysis/instrukciya-novye-atributy-maskirovaniya-otchet-brokera.docx
+++ b/docs/analysis/instrukciya-novye-atributy-maskirovaniya-otchet-brokera.docx
@@ -1172,7 +1172,7 @@
                 <w:sz w:val="19"/>
                 <w:szCs w:val="19"/>
               </w:rPr>
-              <w:t xml:space="preserve">\b[А-Я]{2}\d{4,6}(?:-[А-Я]{2}-\d{1,3})?\b</w:t>
+              <w:t xml:space="preserve">\b[A-ZА-Я]{2}\d{4,6}(?:-[A-ZА-Я]{2}-\d{1,3})?\b</w:t>
             </w:r>
           </w:p>
         </w:tc>
@@ -1251,6 +1251,141 @@
       <w:r>
         <w:rPr>
           <w:rFonts w:ascii="Calibri" w:cs="Calibri" w:eastAsia="Calibri" w:hAnsi="Calibri"/>
+          <w:b/>
+          <w:bCs/>
+          <w:i w:val="false"/>
+          <w:iCs w:val="false"/>
+          <w:color w:val="1A1A1A"/>
+          <w:sz w:val="21"/>
+          <w:szCs w:val="21"/>
+        </w:rPr>
+        <w:t xml:space="preserve">Буквы — кириллица или латиница (17.08.2026).</w:t>
+      </w:r>
+      <w:r>
+        <w:rPr>
+          <w:rFonts w:ascii="Calibri" w:cs="Calibri" w:eastAsia="Calibri" w:hAnsi="Calibri"/>
+          <w:b w:val="false"/>
+          <w:bCs w:val="false"/>
+          <w:i w:val="false"/>
+          <w:iCs w:val="false"/>
+          <w:color w:val="1A1A1A"/>
+          <w:sz w:val="21"/>
+          <w:szCs w:val="21"/>
+        </w:rPr>
+        <w:t xml:space="preserve"> Тестовые данные показывали только кириллицу (</w:t>
+      </w:r>
+      <w:r>
+        <w:rPr>
+          <w:rFonts w:ascii="Consolas" w:cs="Consolas" w:eastAsia="Consolas" w:hAnsi="Consolas"/>
+          <w:b w:val="false"/>
+          <w:bCs w:val="false"/>
+          <w:i w:val="false"/>
+          <w:iCs w:val="false"/>
+          <w:color w:val="1A1A1A"/>
+          <w:sz w:val="19"/>
+          <w:szCs w:val="19"/>
+        </w:rPr>
+        <w:t xml:space="preserve">ВР33431</w:t>
+      </w:r>
+      <w:r>
+        <w:rPr>
+          <w:rFonts w:ascii="Calibri" w:cs="Calibri" w:eastAsia="Calibri" w:hAnsi="Calibri"/>
+          <w:b w:val="false"/>
+          <w:bCs w:val="false"/>
+          <w:i w:val="false"/>
+          <w:iCs w:val="false"/>
+          <w:color w:val="1A1A1A"/>
+          <w:sz w:val="21"/>
+          <w:szCs w:val="21"/>
+        </w:rPr>
+        <w:t xml:space="preserve">), но реальные номера договоров/счетов могут использовать латинские буквы (например </w:t>
+      </w:r>
+      <w:r>
+        <w:rPr>
+          <w:rFonts w:ascii="Consolas" w:cs="Consolas" w:eastAsia="Consolas" w:hAnsi="Consolas"/>
+          <w:b w:val="false"/>
+          <w:bCs w:val="false"/>
+          <w:i w:val="false"/>
+          <w:iCs w:val="false"/>
+          <w:color w:val="1A1A1A"/>
+          <w:sz w:val="19"/>
+          <w:szCs w:val="19"/>
+        </w:rPr>
+        <w:t xml:space="preserve">BP33431</w:t>
+      </w:r>
+      <w:r>
+        <w:rPr>
+          <w:rFonts w:ascii="Calibri" w:cs="Calibri" w:eastAsia="Calibri" w:hAnsi="Calibri"/>
+          <w:b w:val="false"/>
+          <w:bCs w:val="false"/>
+          <w:i w:val="false"/>
+          <w:iCs w:val="false"/>
+          <w:color w:val="1A1A1A"/>
+          <w:sz w:val="21"/>
+          <w:szCs w:val="21"/>
+        </w:rPr>
+        <w:t xml:space="preserve">). Первая версия паттерна (</w:t>
+      </w:r>
+      <w:r>
+        <w:rPr>
+          <w:rFonts w:ascii="Consolas" w:cs="Consolas" w:eastAsia="Consolas" w:hAnsi="Consolas"/>
+          <w:b w:val="false"/>
+          <w:bCs w:val="false"/>
+          <w:i w:val="false"/>
+          <w:iCs w:val="false"/>
+          <w:color w:val="1A1A1A"/>
+          <w:sz w:val="19"/>
+          <w:szCs w:val="19"/>
+        </w:rPr>
+        <w:t xml:space="preserve">[А-Я]{2}</w:t>
+      </w:r>
+      <w:r>
+        <w:rPr>
+          <w:rFonts w:ascii="Calibri" w:cs="Calibri" w:eastAsia="Calibri" w:hAnsi="Calibri"/>
+          <w:b w:val="false"/>
+          <w:bCs w:val="false"/>
+          <w:i w:val="false"/>
+          <w:iCs w:val="false"/>
+          <w:color w:val="1A1A1A"/>
+          <w:sz w:val="21"/>
+          <w:szCs w:val="21"/>
+        </w:rPr>
+        <w:t xml:space="preserve">) пропустила бы такие значения — обновлено на </w:t>
+      </w:r>
+      <w:r>
+        <w:rPr>
+          <w:rFonts w:ascii="Consolas" w:cs="Consolas" w:eastAsia="Consolas" w:hAnsi="Consolas"/>
+          <w:b w:val="false"/>
+          <w:bCs w:val="false"/>
+          <w:i w:val="false"/>
+          <w:iCs w:val="false"/>
+          <w:color w:val="1A1A1A"/>
+          <w:sz w:val="19"/>
+          <w:szCs w:val="19"/>
+        </w:rPr>
+        <w:t xml:space="preserve">[A-ZА-Я]{2}</w:t>
+      </w:r>
+      <w:r>
+        <w:rPr>
+          <w:rFonts w:ascii="Calibri" w:cs="Calibri" w:eastAsia="Calibri" w:hAnsi="Calibri"/>
+          <w:b w:val="false"/>
+          <w:bCs w:val="false"/>
+          <w:i w:val="false"/>
+          <w:iCs w:val="false"/>
+          <w:color w:val="1A1A1A"/>
+          <w:sz w:val="21"/>
+          <w:szCs w:val="21"/>
+        </w:rPr>
+        <w:t xml:space="preserve">, чтобы покрыть оба алфавита сразу в обеих буквенных группах.</w:t>
+      </w:r>
+    </w:p>
+    <w:p>
+      <w:pPr>
+        <w:spacing w:after="160" w:line="300"/>
+      </w:pPr>
+      <w:r>
+        <w:rPr>
+          <w:rFonts w:ascii="Calibri" w:cs="Calibri" w:eastAsia="Calibri" w:hAnsi="Calibri"/>
           <w:b w:val="false"/>
           <w:bCs w:val="false"/>
           <w:i w:val="false"/>
@@ -1311,7 +1446,33 @@
           <w:sz w:val="21"/>
           <w:szCs w:val="21"/>
         </w:rPr>
-        <w:t xml:space="preserve"> → совпадение. Ложных срабатываний на соседних полях того же отчёта не даёт: баланс (</w:t>
+        <w:t xml:space="preserve"> → совпадение, </w:t>
+      </w:r>
+      <w:r>
+        <w:rPr>
+          <w:rFonts w:ascii="Consolas" w:cs="Consolas" w:eastAsia="Consolas" w:hAnsi="Consolas"/>
+          <w:b w:val="false"/>
+          <w:bCs w:val="false"/>
+          <w:i w:val="false"/>
+          <w:iCs w:val="false"/>
+          <w:color w:val="1A1A1A"/>
+          <w:sz w:val="19"/>
+          <w:szCs w:val="19"/>
+        </w:rPr>
+        <w:t xml:space="preserve">BP33431</w:t>
+      </w:r>
+      <w:r>
+        <w:rPr>
+          <w:rFonts w:ascii="Calibri" w:cs="Calibri" w:eastAsia="Calibri" w:hAnsi="Calibri"/>
+          <w:b w:val="false"/>
+          <w:bCs w:val="false"/>
+          <w:i w:val="false"/>
+          <w:iCs w:val="false"/>
+          <w:color w:val="1A1A1A"/>
+          <w:sz w:val="21"/>
+          <w:szCs w:val="21"/>
+        </w:rPr>
+        <w:t xml:space="preserve"> → совпадение (латиница). Ложных срабатываний на соседних полях того же отчёта не даёт: баланс (</w:t>
       </w:r>
       <w:r>
         <w:rPr>
@@ -1415,7 +1576,33 @@
           <w:sz w:val="21"/>
           <w:szCs w:val="21"/>
         </w:rPr>
-        <w:t xml:space="preserve">) — ни один не матчится.</w:t>
+        <w:t xml:space="preserve">) — ни один не матчится (в ISIN после первых двух латинских букв идёт всего 3 цифры подряд, а не 4–6, поэтому </w:t>
+      </w:r>
+      <w:r>
+        <w:rPr>
+          <w:rFonts w:ascii="Consolas" w:cs="Consolas" w:eastAsia="Consolas" w:hAnsi="Consolas"/>
+          <w:b w:val="false"/>
+          <w:bCs w:val="false"/>
+          <w:i w:val="false"/>
+          <w:iCs w:val="false"/>
+          <w:color w:val="1A1A1A"/>
+          <w:sz w:val="19"/>
+          <w:szCs w:val="19"/>
+        </w:rPr>
+        <w:t xml:space="preserve">\d{4,6}</w:t>
+      </w:r>
+      <w:r>
+        <w:rPr>
+          <w:rFonts w:ascii="Calibri" w:cs="Calibri" w:eastAsia="Calibri" w:hAnsi="Calibri"/>
+          <w:b w:val="false"/>
+          <w:bCs w:val="false"/>
+          <w:i w:val="false"/>
+          <w:iCs w:val="false"/>
+          <w:color w:val="1A1A1A"/>
+          <w:sz w:val="21"/>
+          <w:szCs w:val="21"/>
+        </w:rPr>
+        <w:t xml:space="preserve"> не совпадает).</w:t>
       </w:r>
     </w:p>
     <w:p>
@@ -2371,33 +2558,59 @@
           <w:sz w:val="21"/>
           <w:szCs w:val="21"/>
         </w:rPr>
-        <w:t xml:space="preserve"> оба паттерна сохранены на экране «Regex-паттерны» и активны («Всего: 2 паттернов, 2 активных»). Паттерн 2 (лицензия) в системе пока сохранён со </w:t>
-      </w:r>
-      <w:r>
-        <w:rPr>
-          <w:rFonts w:ascii="Calibri" w:cs="Calibri" w:eastAsia="Calibri" w:hAnsi="Calibri"/>
-          <w:b/>
-          <w:bCs/>
-          <w:i w:val="false"/>
-          <w:iCs w:val="false"/>
-          <w:color w:val="1A1A1A"/>
-          <w:sz w:val="21"/>
-          <w:szCs w:val="21"/>
-        </w:rPr>
-        <w:t xml:space="preserve">старой</w:t>
-      </w:r>
-      <w:r>
-        <w:rPr>
-          <w:rFonts w:ascii="Calibri" w:cs="Calibri" w:eastAsia="Calibri" w:hAnsi="Calibri"/>
-          <w:b w:val="false"/>
-          <w:bCs w:val="false"/>
-          <w:i w:val="false"/>
-          <w:iCs w:val="false"/>
-          <w:color w:val="1A1A1A"/>
-          <w:sz w:val="21"/>
-          <w:szCs w:val="21"/>
-        </w:rPr>
-        <w:t xml:space="preserve"> версией regex (</w:t>
+        <w:t xml:space="preserve"> оба паттерна сохранены на экране «Regex-паттерны» и активны («Всего: 2 паттернов, 2 активных»), но у обоих в системе — устаревшая версия regex, нужно обновить через «Изменить» → «Сохранить»: паттерн 1 (договор/счёт) сохранён как </w:t>
+      </w:r>
+      <w:r>
+        <w:rPr>
+          <w:rFonts w:ascii="Consolas" w:cs="Consolas" w:eastAsia="Consolas" w:hAnsi="Consolas"/>
+          <w:b w:val="false"/>
+          <w:bCs w:val="false"/>
+          <w:i w:val="false"/>
+          <w:iCs w:val="false"/>
+          <w:color w:val="1A1A1A"/>
+          <w:sz w:val="19"/>
+          <w:szCs w:val="19"/>
+        </w:rPr>
+        <w:t xml:space="preserve">\b[А-Я]{2}\d{4,6}(?:-[А-Я]{2}-\d{1,3})?\b</w:t>
+      </w:r>
+      <w:r>
+        <w:rPr>
+          <w:rFonts w:ascii="Calibri" w:cs="Calibri" w:eastAsia="Calibri" w:hAnsi="Calibri"/>
+          <w:b w:val="false"/>
+          <w:bCs w:val="false"/>
+          <w:i w:val="false"/>
+          <w:iCs w:val="false"/>
+          <w:color w:val="1A1A1A"/>
+          <w:sz w:val="21"/>
+          <w:szCs w:val="21"/>
+        </w:rPr>
+        <w:t xml:space="preserve"> (только кириллица) — обновить на </w:t>
+      </w:r>
+      <w:r>
+        <w:rPr>
+          <w:rFonts w:ascii="Consolas" w:cs="Consolas" w:eastAsia="Consolas" w:hAnsi="Consolas"/>
+          <w:b w:val="false"/>
+          <w:bCs w:val="false"/>
+          <w:i w:val="false"/>
+          <w:iCs w:val="false"/>
+          <w:color w:val="1A1A1A"/>
+          <w:sz w:val="19"/>
+          <w:szCs w:val="19"/>
+        </w:rPr>
+        <w:t xml:space="preserve">\b[A-ZА-Я]{2}\d{4,6}(?:-[A-ZА-Я]{2}-\d{1,3})?\b</w:t>
+      </w:r>
+      <w:r>
+        <w:rPr>
+          <w:rFonts w:ascii="Calibri" w:cs="Calibri" w:eastAsia="Calibri" w:hAnsi="Calibri"/>
+          <w:b w:val="false"/>
+          <w:bCs w:val="false"/>
+          <w:i w:val="false"/>
+          <w:iCs w:val="false"/>
+          <w:color w:val="1A1A1A"/>
+          <w:sz w:val="21"/>
+          <w:szCs w:val="21"/>
+        </w:rPr>
+        <w:t xml:space="preserve">; паттерн 2 (лицензия) сохранён как </w:t>
       </w:r>
       <w:r>
         <w:rPr>
@@ -2423,7 +2636,7 @@
           <w:sz w:val="21"/>
           <w:szCs w:val="21"/>
         </w:rPr>
-        <w:t xml:space="preserve">, 2 группы цифр) — нужно вручную отредактировать его на актуальную </w:t>
+        <w:t xml:space="preserve"> (2 группы цифр) — обновить на </w:t>
       </w:r>
       <w:r>
         <w:rPr>
@@ -2449,7 +2662,7 @@
           <w:sz w:val="21"/>
           <w:szCs w:val="21"/>
         </w:rPr>
-        <w:t xml:space="preserve"> (3 группы, см. раздел 3) через «Изменить» → «Сохранить».</w:t>
+        <w:t xml:space="preserve"> (3 группы, см. раздел 3).</w:t>
       </w:r>
     </w:p>
     <w:p>
@@ -2648,7 +2861,33 @@
           <w:sz w:val="21"/>
           <w:szCs w:val="21"/>
         </w:rPr>
-        <w:t xml:space="preserve">На экране «Regex-паттерны» открыть «Изменить» у паттерна 1, в поле «Тестовый текст» ввести </w:t>
+        <w:t xml:space="preserve">На экране «Regex-паттерны» открыть «Изменить» у паттерна 1, обновить regex на </w:t>
+      </w:r>
+      <w:r>
+        <w:rPr>
+          <w:rFonts w:ascii="Consolas" w:cs="Consolas" w:eastAsia="Consolas" w:hAnsi="Consolas"/>
+          <w:b w:val="false"/>
+          <w:bCs w:val="false"/>
+          <w:i w:val="false"/>
+          <w:iCs w:val="false"/>
+          <w:color w:val="1A1A1A"/>
+          <w:sz w:val="19"/>
+          <w:szCs w:val="19"/>
+        </w:rPr>
+        <w:t xml:space="preserve">\b[A-ZА-Я]{2}\d{4,6}(?:-[A-ZА-Я]{2}-\d{1,3})?\b</w:t>
+      </w:r>
+      <w:r>
+        <w:rPr>
+          <w:rFonts w:ascii="Calibri" w:cs="Calibri" w:eastAsia="Calibri" w:hAnsi="Calibri"/>
+          <w:b w:val="false"/>
+          <w:bCs w:val="false"/>
+          <w:i w:val="false"/>
+          <w:iCs w:val="false"/>
+          <w:color w:val="1A1A1A"/>
+          <w:sz w:val="21"/>
+          <w:szCs w:val="21"/>
+        </w:rPr>
+        <w:t xml:space="preserve">, сохранить. В поле «Тестовый текст» ввести </w:t>
       </w:r>
       <w:r>
         <w:rPr>
@@ -2688,6 +2927,32 @@
           <w:szCs w:val="19"/>
         </w:rPr>
         <w:t xml:space="preserve">ВР33431-МО-01</w:t>
+      </w:r>
+      <w:r>
+        <w:rPr>
+          <w:rFonts w:ascii="Calibri" w:cs="Calibri" w:eastAsia="Calibri" w:hAnsi="Calibri"/>
+          <w:b w:val="false"/>
+          <w:bCs w:val="false"/>
+          <w:i w:val="false"/>
+          <w:iCs w:val="false"/>
+          <w:color w:val="1A1A1A"/>
+          <w:sz w:val="21"/>
+          <w:szCs w:val="21"/>
+        </w:rPr>
+        <w:t xml:space="preserve">, или латиницей </w:t>
+      </w:r>
+      <w:r>
+        <w:rPr>
+          <w:rFonts w:ascii="Consolas" w:cs="Consolas" w:eastAsia="Consolas" w:hAnsi="Consolas"/>
+          <w:b w:val="false"/>
+          <w:bCs w:val="false"/>
+          <w:i w:val="false"/>
+          <w:iCs w:val="false"/>
+          <w:color w:val="1A1A1A"/>
+          <w:sz w:val="19"/>
+          <w:szCs w:val="19"/>
+        </w:rPr>
+        <w:t xml:space="preserve">BP33431</w:t>
       </w:r>
       <w:r>
         <w:rPr>
@@ -2723,7 +2988,33 @@
           <w:sz w:val="21"/>
           <w:szCs w:val="21"/>
         </w:rPr>
-        <w:t xml:space="preserve">После исправления regex у паттерна 2 — аналогично, тестовый текст </w:t>
+        <w:t xml:space="preserve">Аналогично для паттерна 2: обновить regex на </w:t>
+      </w:r>
+      <w:r>
+        <w:rPr>
+          <w:rFonts w:ascii="Consolas" w:cs="Consolas" w:eastAsia="Consolas" w:hAnsi="Consolas"/>
+          <w:b w:val="false"/>
+          <w:bCs w:val="false"/>
+          <w:i w:val="false"/>
+          <w:iCs w:val="false"/>
+          <w:color w:val="1A1A1A"/>
+          <w:sz w:val="19"/>
+          <w:szCs w:val="19"/>
+        </w:rPr>
+        <w:t xml:space="preserve">№\s?\d{2,3}-\d{4,6}-\d{4,6}</w:t>
+      </w:r>
+      <w:r>
+        <w:rPr>
+          <w:rFonts w:ascii="Calibri" w:cs="Calibri" w:eastAsia="Calibri" w:hAnsi="Calibri"/>
+          <w:b w:val="false"/>
+          <w:bCs w:val="false"/>
+          <w:i w:val="false"/>
+          <w:iCs w:val="false"/>
+          <w:color w:val="1A1A1A"/>
+          <w:sz w:val="21"/>
+          <w:szCs w:val="21"/>
+        </w:rPr>
+        <w:t xml:space="preserve">, сохранить, тестовый текст </w:t>
       </w:r>
       <w:r>
         <w:rPr>

</xml_diff>